<commit_message>
feat<extractor>: triển khai trích xuất đặc trưng màu sắc và kêt cấu
</commit_message>
<xml_diff>
--- a/reports/features.docx
+++ b/reports/features.docx
@@ -2,10 +2,136 @@
 <file path=word/document.xml><?xml version="1.0" encoding="utf-8"?>
 <w:document xmlns:wpc="http://schemas.microsoft.com/office/word/2010/wordprocessingCanvas" xmlns:cx="http://schemas.microsoft.com/office/drawing/2014/chartex" xmlns:cx1="http://schemas.microsoft.com/office/drawing/2015/9/8/chartex" xmlns:cx2="http://schemas.microsoft.com/office/drawing/2015/10/21/chartex" xmlns:cx3="http://schemas.microsoft.com/office/drawing/2016/5/9/chartex" xmlns:cx4="http://schemas.microsoft.com/office/drawing/2016/5/10/chartex" xmlns:cx5="http://schemas.microsoft.com/office/drawing/2016/5/11/chartex" xmlns:cx6="http://schemas.microsoft.com/office/drawing/2016/5/12/chartex" xmlns:cx7="http://schemas.microsoft.com/office/drawing/2016/5/13/chartex" xmlns:cx8="http://schemas.microsoft.com/office/drawing/2016/5/14/chartex" xmlns:mc="http://schemas.openxmlformats.org/markup-compatibility/2006" xmlns:aink="http://schemas.microsoft.com/office/drawing/2016/ink" xmlns:am3d="http://schemas.microsoft.com/office/drawing/2017/model3d" xmlns:o="urn:schemas-microsoft-com:office:office" xmlns:oel="http://schemas.microsoft.com/office/2019/extlst" xmlns:r="http://schemas.openxmlformats.org/officeDocument/2006/relationships" xmlns:m="http://schemas.openxmlformats.org/officeDocument/2006/math" xmlns:v="urn:schemas-microsoft-com:vml" xmlns:wp14="http://schemas.microsoft.com/office/word/2010/wordprocessingDrawing" xmlns:wp="http://schemas.openxmlformats.org/drawingml/2006/wordprocessingDrawing" xmlns:w10="urn:schemas-microsoft-com:office:word" xmlns:w="http://schemas.openxmlformats.org/wordprocessingml/2006/main" xmlns:w14="http://schemas.microsoft.com/office/word/2010/wordml" xmlns:w15="http://schemas.microsoft.com/office/word/2012/wordml" xmlns:w16cex="http://schemas.microsoft.com/office/word/2018/wordml/cex" xmlns:w16cid="http://schemas.microsoft.com/office/word/2016/wordml/cid" xmlns:w16="http://schemas.microsoft.com/office/word/2018/wordml" xmlns:w16du="http://schemas.microsoft.com/office/word/2023/wordml/word16du" xmlns:w16sdtdh="http://schemas.microsoft.com/office/word/2020/wordml/sdtdatahash" xmlns:w16sdtfl="http://schemas.microsoft.com/office/word/2024/wordml/sdtformatlock" xmlns:w16se="http://schemas.microsoft.com/office/word/2015/wordml/symex" xmlns:wpg="http://schemas.microsoft.com/office/word/2010/wordprocessingGroup" xmlns:wpi="http://schemas.microsoft.com/office/word/2010/wordprocessingInk" xmlns:wne="http://schemas.microsoft.com/office/word/2006/wordml" xmlns:wps="http://schemas.microsoft.com/office/word/2010/wordprocessingShape" mc:Ignorable="w14 w15 w16se w16cid w16 w16cex w16sdtdh w16sdtfl w16du wp14">
   <w:body>
-    <w:p>
-      <w:pPr>
-        <w:pStyle w:val="Heading1"/>
-        <w:rPr>
+    <w:sdt>
+      <w:sdtPr>
+        <w:id w:val="736745614"/>
+        <w:docPartObj>
+          <w:docPartGallery w:val="Table of Contents"/>
+          <w:docPartUnique/>
+        </w:docPartObj>
+      </w:sdtPr>
+      <w:sdtEndPr>
+        <w:rPr>
+          <w:rFonts w:ascii="Times New Roman" w:eastAsiaTheme="minorEastAsia" w:hAnsi="Times New Roman" w:cs="Times New Roman"/>
+          <w:b/>
+          <w:bCs/>
+          <w:noProof/>
+          <w:color w:val="auto"/>
+          <w:kern w:val="2"/>
+          <w:sz w:val="28"/>
+          <w:szCs w:val="28"/>
+          <w:lang w:eastAsia="zh-CN"/>
+          <w14:ligatures w14:val="standardContextual"/>
+        </w:rPr>
+      </w:sdtEndPr>
+      <w:sdtContent>
+        <w:p>
+          <w:pPr>
+            <w:pStyle w:val="TOCHeading"/>
+          </w:pPr>
+          <w:r>
+            <w:t>Contents</w:t>
+          </w:r>
+        </w:p>
+        <w:p>
+          <w:pPr>
+            <w:pStyle w:val="TOC1"/>
+            <w:tabs>
+              <w:tab w:val="right" w:leader="dot" w:pos="9350"/>
+            </w:tabs>
+            <w:rPr>
+              <w:noProof/>
+            </w:rPr>
+          </w:pPr>
+          <w:r>
+            <w:fldChar w:fldCharType="begin"/>
+          </w:r>
+          <w:r>
+            <w:instrText xml:space="preserve"> TOC \o "1-3" \h \z \u </w:instrText>
+          </w:r>
+          <w:r>
+            <w:fldChar w:fldCharType="separate"/>
+          </w:r>
+          <w:hyperlink w:anchor="_Toc224978511" w:history="1">
+            <w:r>
+              <w:rPr>
+                <w:rStyle w:val="Hyperlink"/>
+                <w:noProof/>
+                <w:lang w:val="vi-VN"/>
+              </w:rPr>
+              <w:t>I. Hình dạng</w:t>
+            </w:r>
+            <w:r>
+              <w:rPr>
+                <w:noProof/>
+                <w:webHidden/>
+              </w:rPr>
+              <w:tab/>
+            </w:r>
+            <w:r>
+              <w:rPr>
+                <w:noProof/>
+                <w:webHidden/>
+              </w:rPr>
+              <w:fldChar w:fldCharType="begin"/>
+            </w:r>
+            <w:r>
+              <w:rPr>
+                <w:noProof/>
+                <w:webHidden/>
+              </w:rPr>
+              <w:instrText xml:space="preserve"> PAGEREF _Toc224978511 \h </w:instrText>
+            </w:r>
+            <w:r>
+              <w:rPr>
+                <w:noProof/>
+                <w:webHidden/>
+              </w:rPr>
+            </w:r>
+            <w:r>
+              <w:rPr>
+                <w:noProof/>
+                <w:webHidden/>
+              </w:rPr>
+              <w:fldChar w:fldCharType="separate"/>
+            </w:r>
+            <w:r>
+              <w:rPr>
+                <w:noProof/>
+                <w:webHidden/>
+              </w:rPr>
+              <w:t>2</w:t>
+            </w:r>
+            <w:r>
+              <w:rPr>
+                <w:noProof/>
+                <w:webHidden/>
+              </w:rPr>
+              <w:fldChar w:fldCharType="end"/>
+            </w:r>
+          </w:hyperlink>
+        </w:p>
+        <w:p>
+          <w:r>
+            <w:rPr>
+              <w:b/>
+              <w:bCs/>
+              <w:noProof/>
+            </w:rPr>
+            <w:fldChar w:fldCharType="end"/>
+          </w:r>
+        </w:p>
+      </w:sdtContent>
+    </w:sdt>
+    <w:p>
+      <w:pPr>
+        <w:rPr>
+          <w:rFonts w:eastAsiaTheme="majorEastAsia"/>
+          <w:b/>
+          <w:bCs/>
+          <w:color w:val="000000" w:themeColor="text1"/>
+          <w:sz w:val="32"/>
+          <w:szCs w:val="32"/>
           <w:lang w:val="vi-VN"/>
         </w:rPr>
       </w:pPr>
@@ -13,23 +139,25 @@
         <w:rPr>
           <w:lang w:val="vi-VN"/>
         </w:rPr>
+        <w:br w:type="page"/>
+      </w:r>
+    </w:p>
+    <w:p>
+      <w:pPr>
+        <w:pStyle w:val="Heading2"/>
+      </w:pPr>
+      <w:bookmarkStart w:id="0" w:name="_Toc224978511"/>
+      <w:r>
+        <w:lastRenderedPageBreak/>
         <w:t>I. Hình dạng</w:t>
       </w:r>
-    </w:p>
-    <w:p>
-      <w:pPr>
-        <w:rPr>
-          <w:b/>
-          <w:bCs/>
-          <w:lang w:val="vi-VN"/>
-        </w:rPr>
-      </w:pPr>
-      <w:r>
-        <w:rPr>
-          <w:b/>
-          <w:bCs/>
-          <w:lang w:val="vi-VN"/>
-        </w:rPr>
+      <w:bookmarkEnd w:id="0"/>
+    </w:p>
+    <w:p>
+      <w:pPr>
+        <w:pStyle w:val="Heading2"/>
+      </w:pPr>
+      <w:r>
         <w:t>Nhóm 1: Các đặc trưng Hình thái Hình học (7 tham số)</w:t>
       </w:r>
     </w:p>
@@ -711,16 +839,9 @@
     </w:p>
     <w:p>
       <w:pPr>
-        <w:rPr>
-          <w:b/>
-          <w:bCs/>
-        </w:rPr>
-      </w:pPr>
-      <w:r>
-        <w:rPr>
-          <w:b/>
-          <w:bCs/>
-        </w:rPr>
+        <w:pStyle w:val="Heading2"/>
+      </w:pPr>
+      <w:r>
         <w:t>Nhóm 2: Các đặc trưng Thống kê Bất biến (3 tham số)</w:t>
       </w:r>
     </w:p>
@@ -858,6 +979,7 @@
     </w:p>
     <w:p>
       <w:pPr>
+        <w:pStyle w:val="Heading1"/>
         <w:rPr>
           <w:lang w:val="vi-VN"/>
         </w:rPr>
@@ -875,16 +997,9 @@
     </w:p>
     <w:p>
       <w:pPr>
-        <w:rPr>
-          <w:b/>
-          <w:bCs/>
-        </w:rPr>
-      </w:pPr>
-      <w:r>
-        <w:rPr>
-          <w:b/>
-          <w:bCs/>
-        </w:rPr>
+        <w:pStyle w:val="Heading2"/>
+      </w:pPr>
+      <w:r>
         <w:t>1. Ma trận đồng hiện mức xám (GLCM - Gray Level Co-occurrence Matrix) / Đặc trưng Haralick</w:t>
       </w:r>
     </w:p>
@@ -1361,16 +1476,9 @@
     </w:p>
     <w:p>
       <w:pPr>
-        <w:rPr>
-          <w:b/>
-          <w:bCs/>
-        </w:rPr>
-      </w:pPr>
-      <w:r>
-        <w:rPr>
-          <w:b/>
-          <w:bCs/>
-        </w:rPr>
+        <w:pStyle w:val="Heading2"/>
+      </w:pPr>
+      <w:r>
         <w:t>2. Bộ lọc Gabor (Gabor Filters)</w:t>
       </w:r>
     </w:p>
@@ -1657,6 +1765,1288 @@
       </w:r>
       <w:r>
         <w:t xml:space="preserve"> Giúp mô tả các vi cấu trúc cục bộ trên lá như các đốm nhỏ, gai nhám li ti, hoặc các đoạn cắt xẻ cực nhỏ trên bề mặt thịt lá.</w:t>
+      </w:r>
+    </w:p>
+    <w:p>
+      <w:pPr>
+        <w:pStyle w:val="Heading2"/>
+      </w:pPr>
+      <w:r>
+        <w:t>III. Màu sắc</w:t>
+      </w:r>
+    </w:p>
+    <w:p>
+      <w:pPr>
+        <w:pStyle w:val="Heading2"/>
+      </w:pPr>
+      <w:r>
+        <w:t>Nhóm 1: Color Moments (Các mô-men màu)</w:t>
+      </w:r>
+    </w:p>
+    <w:p>
+      <w:r>
+        <w:t>Đây là nhóm đặc trưng định lượng rất nhỏ gọn và hiệu quả, thường được tính toán trên từng kênh màu (ví dụ: H, S, V). Chỉ với 9 giá trị (3 mô-men x 3 kênh màu), bạn đã có một vector nền tảng khá tốt.</w:t>
+      </w:r>
+    </w:p>
+    <w:p>
+      <w:r>
+        <w:rPr>
+          <w:b/>
+          <w:bCs/>
+        </w:rPr>
+        <w:t>1. Color Mean (Kỳ vọng màu - Moment bậc 1):</w:t>
+      </w:r>
+    </w:p>
+    <w:p>
+      <w:pPr>
+        <w:numPr>
+          <w:ilvl w:val="1"/>
+          <w:numId w:val="7"/>
+        </w:numPr>
+      </w:pPr>
+      <w:r>
+        <w:rPr>
+          <w:b/>
+          <w:bCs/>
+        </w:rPr>
+        <w:t>Định nghĩa:</w:t>
+      </w:r>
+      <w:r>
+        <w:t xml:space="preserve"> Giá trị trung bình của từng kênh màu trên toàn bộ vùng lá.</w:t>
+      </w:r>
+    </w:p>
+    <w:p>
+      <w:pPr>
+        <w:numPr>
+          <w:ilvl w:val="1"/>
+          <w:numId w:val="7"/>
+        </w:numPr>
+      </w:pPr>
+      <w:r>
+        <w:rPr>
+          <w:b/>
+          <w:bCs/>
+        </w:rPr>
+        <w:t>Công thức:</w:t>
+      </w:r>
+      <w:r>
+        <w:t xml:space="preserve"> </w:t>
+      </w:r>
+      <m:oMath>
+        <m:sSub>
+          <m:sSubPr>
+            <m:ctrlPr>
+              <w:rPr>
+                <w:rFonts w:ascii="Cambria Math" w:hAnsi="Cambria Math"/>
+                <w:i/>
+                <w:iCs/>
+              </w:rPr>
+            </m:ctrlPr>
+          </m:sSubPr>
+          <m:e>
+            <m:r>
+              <m:rPr>
+                <m:sty m:val="p"/>
+              </m:rPr>
+              <w:rPr>
+                <w:rFonts w:ascii="Cambria Math" w:hAnsi="Cambria Math"/>
+              </w:rPr>
+              <m:t>μ</m:t>
+            </m:r>
+            <m:ctrlPr>
+              <w:rPr>
+                <w:rFonts w:ascii="Cambria Math" w:hAnsi="Cambria Math"/>
+                <w:iCs/>
+              </w:rPr>
+            </m:ctrlPr>
+          </m:e>
+          <m:sub>
+            <m:r>
+              <w:rPr>
+                <w:rFonts w:ascii="Cambria Math" w:hAnsi="Cambria Math"/>
+              </w:rPr>
+              <m:t>c</m:t>
+            </m:r>
+          </m:sub>
+        </m:sSub>
+        <m:r>
+          <w:rPr>
+            <w:rFonts w:ascii="Cambria Math" w:hAnsi="Cambria Math"/>
+          </w:rPr>
+          <m:t>=</m:t>
+        </m:r>
+        <m:f>
+          <m:fPr>
+            <m:ctrlPr>
+              <w:rPr>
+                <w:rFonts w:ascii="Cambria Math" w:hAnsi="Cambria Math"/>
+                <w:iCs/>
+              </w:rPr>
+            </m:ctrlPr>
+          </m:fPr>
+          <m:num>
+            <m:r>
+              <w:rPr>
+                <w:rFonts w:ascii="Cambria Math" w:hAnsi="Cambria Math"/>
+              </w:rPr>
+              <m:t>1</m:t>
+            </m:r>
+            <m:ctrlPr>
+              <w:rPr>
+                <w:rFonts w:ascii="Cambria Math" w:hAnsi="Cambria Math"/>
+                <w:i/>
+                <w:iCs/>
+              </w:rPr>
+            </m:ctrlPr>
+          </m:num>
+          <m:den>
+            <m:r>
+              <w:rPr>
+                <w:rFonts w:ascii="Cambria Math" w:hAnsi="Cambria Math"/>
+              </w:rPr>
+              <m:t>N</m:t>
+            </m:r>
+            <m:ctrlPr>
+              <w:rPr>
+                <w:rFonts w:ascii="Cambria Math" w:hAnsi="Cambria Math"/>
+                <w:i/>
+                <w:iCs/>
+              </w:rPr>
+            </m:ctrlPr>
+          </m:den>
+        </m:f>
+        <m:nary>
+          <m:naryPr>
+            <m:chr m:val="∑"/>
+            <m:ctrlPr>
+              <w:rPr>
+                <w:rFonts w:ascii="Cambria Math" w:hAnsi="Cambria Math"/>
+                <w:iCs/>
+              </w:rPr>
+            </m:ctrlPr>
+          </m:naryPr>
+          <m:sub>
+            <m:r>
+              <w:rPr>
+                <w:rFonts w:ascii="Cambria Math" w:hAnsi="Cambria Math"/>
+              </w:rPr>
+              <m:t>i=1</m:t>
+            </m:r>
+            <m:ctrlPr>
+              <w:rPr>
+                <w:rFonts w:ascii="Cambria Math" w:hAnsi="Cambria Math"/>
+                <w:i/>
+                <w:iCs/>
+              </w:rPr>
+            </m:ctrlPr>
+          </m:sub>
+          <m:sup>
+            <m:r>
+              <w:rPr>
+                <w:rFonts w:ascii="Cambria Math" w:hAnsi="Cambria Math"/>
+              </w:rPr>
+              <m:t>N</m:t>
+            </m:r>
+            <m:ctrlPr>
+              <w:rPr>
+                <w:rFonts w:ascii="Cambria Math" w:hAnsi="Cambria Math"/>
+                <w:i/>
+                <w:iCs/>
+              </w:rPr>
+            </m:ctrlPr>
+          </m:sup>
+          <m:e>
+            <m:sSub>
+              <m:sSubPr>
+                <m:ctrlPr>
+                  <w:rPr>
+                    <w:rFonts w:ascii="Cambria Math" w:hAnsi="Cambria Math"/>
+                    <w:i/>
+                    <w:iCs/>
+                  </w:rPr>
+                </m:ctrlPr>
+              </m:sSubPr>
+              <m:e>
+                <m:r>
+                  <w:rPr>
+                    <w:rFonts w:ascii="Cambria Math" w:hAnsi="Cambria Math"/>
+                  </w:rPr>
+                  <m:t>p</m:t>
+                </m:r>
+              </m:e>
+              <m:sub>
+                <m:r>
+                  <w:rPr>
+                    <w:rFonts w:ascii="Cambria Math" w:hAnsi="Cambria Math"/>
+                  </w:rPr>
+                  <m:t>i,c</m:t>
+                </m:r>
+              </m:sub>
+            </m:sSub>
+            <m:ctrlPr>
+              <w:rPr>
+                <w:rFonts w:ascii="Cambria Math" w:hAnsi="Cambria Math"/>
+                <w:i/>
+                <w:iCs/>
+              </w:rPr>
+            </m:ctrlPr>
+          </m:e>
+        </m:nary>
+      </m:oMath>
+      <w:r>
+        <w:t xml:space="preserve"> (với </w:t>
+      </w:r>
+      <m:oMath>
+        <m:r>
+          <w:rPr>
+            <w:rFonts w:ascii="Cambria Math" w:hAnsi="Cambria Math"/>
+          </w:rPr>
+          <m:t>N</m:t>
+        </m:r>
+      </m:oMath>
+      <w:r>
+        <w:t xml:space="preserve"> là số pixel của lá, </w:t>
+      </w:r>
+      <m:oMath>
+        <m:sSub>
+          <m:sSubPr>
+            <m:ctrlPr>
+              <w:rPr>
+                <w:rFonts w:ascii="Cambria Math" w:hAnsi="Cambria Math"/>
+                <w:i/>
+                <w:iCs/>
+              </w:rPr>
+            </m:ctrlPr>
+          </m:sSubPr>
+          <m:e>
+            <m:r>
+              <w:rPr>
+                <w:rFonts w:ascii="Cambria Math" w:hAnsi="Cambria Math"/>
+              </w:rPr>
+              <m:t>p</m:t>
+            </m:r>
+          </m:e>
+          <m:sub>
+            <m:r>
+              <w:rPr>
+                <w:rFonts w:ascii="Cambria Math" w:hAnsi="Cambria Math"/>
+              </w:rPr>
+              <m:t>i,c</m:t>
+            </m:r>
+          </m:sub>
+        </m:sSub>
+      </m:oMath>
+      <w:r>
+        <w:t xml:space="preserve"> là giá trị pixel thứ </w:t>
+      </w:r>
+      <m:oMath>
+        <m:r>
+          <w:rPr>
+            <w:rFonts w:ascii="Cambria Math" w:hAnsi="Cambria Math"/>
+          </w:rPr>
+          <m:t>i</m:t>
+        </m:r>
+      </m:oMath>
+      <w:r>
+        <w:t xml:space="preserve"> trên kênh màu </w:t>
+      </w:r>
+      <m:oMath>
+        <m:r>
+          <w:rPr>
+            <w:rFonts w:ascii="Cambria Math" w:hAnsi="Cambria Math"/>
+          </w:rPr>
+          <m:t>c</m:t>
+        </m:r>
+      </m:oMath>
+      <w:r>
+        <w:rPr>
+          <w:lang w:val="vi-VN"/>
+        </w:rPr>
+        <w:t xml:space="preserve"> </w:t>
+      </w:r>
+      <w:r>
+        <w:t>).</w:t>
+      </w:r>
+    </w:p>
+    <w:p>
+      <w:pPr>
+        <w:numPr>
+          <w:ilvl w:val="1"/>
+          <w:numId w:val="7"/>
+        </w:numPr>
+      </w:pPr>
+      <w:r>
+        <w:rPr>
+          <w:b/>
+          <w:bCs/>
+        </w:rPr>
+        <w:t>Ý nghĩa:</w:t>
+      </w:r>
+      <w:r>
+        <w:t xml:space="preserve"> Xác định tông màu tổng thể của chiếc lá (xanh lá, vàng, đỏ, v.v.).</w:t>
+      </w:r>
+    </w:p>
+    <w:p>
+      <w:r>
+        <w:rPr>
+          <w:b/>
+          <w:bCs/>
+        </w:rPr>
+        <w:t>2. Color Standard Deviation (Độ lệch chuẩn màu - Moment bậc 2):</w:t>
+      </w:r>
+    </w:p>
+    <w:p>
+      <w:pPr>
+        <w:numPr>
+          <w:ilvl w:val="1"/>
+          <w:numId w:val="7"/>
+        </w:numPr>
+      </w:pPr>
+      <w:r>
+        <w:rPr>
+          <w:b/>
+          <w:bCs/>
+        </w:rPr>
+        <w:t>Định nghĩa:</w:t>
+      </w:r>
+      <w:r>
+        <w:t xml:space="preserve"> Biểu diễn độ phân tán của màu sắc xung quanh giá trị trung bình.</w:t>
+      </w:r>
+    </w:p>
+    <w:p>
+      <w:pPr>
+        <w:numPr>
+          <w:ilvl w:val="1"/>
+          <w:numId w:val="7"/>
+        </w:numPr>
+      </w:pPr>
+      <w:r>
+        <w:rPr>
+          <w:b/>
+          <w:bCs/>
+        </w:rPr>
+        <w:lastRenderedPageBreak/>
+        <w:t>Công thức:</w:t>
+      </w:r>
+      <w:r>
+        <w:t xml:space="preserve"> </w:t>
+      </w:r>
+      <m:oMath>
+        <m:sSub>
+          <m:sSubPr>
+            <m:ctrlPr>
+              <w:rPr>
+                <w:rFonts w:ascii="Cambria Math" w:hAnsi="Cambria Math"/>
+                <w:i/>
+                <w:iCs/>
+              </w:rPr>
+            </m:ctrlPr>
+          </m:sSubPr>
+          <m:e>
+            <m:r>
+              <m:rPr>
+                <m:sty m:val="p"/>
+              </m:rPr>
+              <w:rPr>
+                <w:rFonts w:ascii="Cambria Math" w:hAnsi="Cambria Math"/>
+              </w:rPr>
+              <m:t>σ</m:t>
+            </m:r>
+            <m:ctrlPr>
+              <w:rPr>
+                <w:rFonts w:ascii="Cambria Math" w:hAnsi="Cambria Math"/>
+                <w:iCs/>
+              </w:rPr>
+            </m:ctrlPr>
+          </m:e>
+          <m:sub>
+            <m:r>
+              <w:rPr>
+                <w:rFonts w:ascii="Cambria Math" w:hAnsi="Cambria Math"/>
+              </w:rPr>
+              <m:t>c</m:t>
+            </m:r>
+          </m:sub>
+        </m:sSub>
+        <m:r>
+          <w:rPr>
+            <w:rFonts w:ascii="Cambria Math" w:hAnsi="Cambria Math"/>
+          </w:rPr>
+          <m:t>=</m:t>
+        </m:r>
+        <m:rad>
+          <m:radPr>
+            <m:degHide m:val="1"/>
+            <m:ctrlPr>
+              <w:rPr>
+                <w:rFonts w:ascii="Cambria Math" w:hAnsi="Cambria Math"/>
+                <w:iCs/>
+              </w:rPr>
+            </m:ctrlPr>
+          </m:radPr>
+          <m:deg>
+            <m:ctrlPr>
+              <w:rPr>
+                <w:rFonts w:ascii="Cambria Math" w:hAnsi="Cambria Math"/>
+                <w:i/>
+                <w:iCs/>
+              </w:rPr>
+            </m:ctrlPr>
+          </m:deg>
+          <m:e>
+            <m:f>
+              <m:fPr>
+                <m:ctrlPr>
+                  <w:rPr>
+                    <w:rFonts w:ascii="Cambria Math" w:hAnsi="Cambria Math"/>
+                    <w:iCs/>
+                  </w:rPr>
+                </m:ctrlPr>
+              </m:fPr>
+              <m:num>
+                <m:r>
+                  <w:rPr>
+                    <w:rFonts w:ascii="Cambria Math" w:hAnsi="Cambria Math"/>
+                  </w:rPr>
+                  <m:t>1</m:t>
+                </m:r>
+                <m:ctrlPr>
+                  <w:rPr>
+                    <w:rFonts w:ascii="Cambria Math" w:hAnsi="Cambria Math"/>
+                    <w:i/>
+                    <w:iCs/>
+                  </w:rPr>
+                </m:ctrlPr>
+              </m:num>
+              <m:den>
+                <m:r>
+                  <w:rPr>
+                    <w:rFonts w:ascii="Cambria Math" w:hAnsi="Cambria Math"/>
+                  </w:rPr>
+                  <m:t>N</m:t>
+                </m:r>
+                <m:ctrlPr>
+                  <w:rPr>
+                    <w:rFonts w:ascii="Cambria Math" w:hAnsi="Cambria Math"/>
+                    <w:i/>
+                    <w:iCs/>
+                  </w:rPr>
+                </m:ctrlPr>
+              </m:den>
+            </m:f>
+            <m:nary>
+              <m:naryPr>
+                <m:chr m:val="∑"/>
+                <m:ctrlPr>
+                  <w:rPr>
+                    <w:rFonts w:ascii="Cambria Math" w:hAnsi="Cambria Math"/>
+                    <w:iCs/>
+                  </w:rPr>
+                </m:ctrlPr>
+              </m:naryPr>
+              <m:sub>
+                <m:r>
+                  <w:rPr>
+                    <w:rFonts w:ascii="Cambria Math" w:hAnsi="Cambria Math"/>
+                  </w:rPr>
+                  <m:t>i=1</m:t>
+                </m:r>
+                <m:ctrlPr>
+                  <w:rPr>
+                    <w:rFonts w:ascii="Cambria Math" w:hAnsi="Cambria Math"/>
+                    <w:i/>
+                    <w:iCs/>
+                  </w:rPr>
+                </m:ctrlPr>
+              </m:sub>
+              <m:sup>
+                <m:r>
+                  <w:rPr>
+                    <w:rFonts w:ascii="Cambria Math" w:hAnsi="Cambria Math"/>
+                  </w:rPr>
+                  <m:t>N</m:t>
+                </m:r>
+                <m:ctrlPr>
+                  <w:rPr>
+                    <w:rFonts w:ascii="Cambria Math" w:hAnsi="Cambria Math"/>
+                    <w:i/>
+                    <w:iCs/>
+                  </w:rPr>
+                </m:ctrlPr>
+              </m:sup>
+              <m:e>
+                <m:sSup>
+                  <m:sSupPr>
+                    <m:ctrlPr>
+                      <w:rPr>
+                        <w:rFonts w:ascii="Cambria Math" w:hAnsi="Cambria Math"/>
+                        <w:i/>
+                        <w:iCs/>
+                      </w:rPr>
+                    </m:ctrlPr>
+                  </m:sSupPr>
+                  <m:e>
+                    <m:d>
+                      <m:dPr>
+                        <m:ctrlPr>
+                          <w:rPr>
+                            <w:rFonts w:ascii="Cambria Math" w:hAnsi="Cambria Math"/>
+                            <w:i/>
+                            <w:iCs/>
+                          </w:rPr>
+                        </m:ctrlPr>
+                      </m:dPr>
+                      <m:e>
+                        <m:sSub>
+                          <m:sSubPr>
+                            <m:ctrlPr>
+                              <w:rPr>
+                                <w:rFonts w:ascii="Cambria Math" w:hAnsi="Cambria Math"/>
+                                <w:i/>
+                                <w:iCs/>
+                              </w:rPr>
+                            </m:ctrlPr>
+                          </m:sSubPr>
+                          <m:e>
+                            <m:r>
+                              <w:rPr>
+                                <w:rFonts w:ascii="Cambria Math" w:hAnsi="Cambria Math"/>
+                              </w:rPr>
+                              <m:t>p</m:t>
+                            </m:r>
+                          </m:e>
+                          <m:sub>
+                            <m:r>
+                              <w:rPr>
+                                <w:rFonts w:ascii="Cambria Math" w:hAnsi="Cambria Math"/>
+                              </w:rPr>
+                              <m:t>i,c</m:t>
+                            </m:r>
+                          </m:sub>
+                        </m:sSub>
+                        <m:r>
+                          <w:rPr>
+                            <w:rFonts w:ascii="Cambria Math" w:hAnsi="Cambria Math"/>
+                          </w:rPr>
+                          <m:t>-</m:t>
+                        </m:r>
+                        <m:sSub>
+                          <m:sSubPr>
+                            <m:ctrlPr>
+                              <w:rPr>
+                                <w:rFonts w:ascii="Cambria Math" w:hAnsi="Cambria Math"/>
+                                <w:i/>
+                                <w:iCs/>
+                              </w:rPr>
+                            </m:ctrlPr>
+                          </m:sSubPr>
+                          <m:e>
+                            <m:r>
+                              <m:rPr>
+                                <m:sty m:val="p"/>
+                              </m:rPr>
+                              <w:rPr>
+                                <w:rFonts w:ascii="Cambria Math" w:hAnsi="Cambria Math"/>
+                              </w:rPr>
+                              <m:t>μ</m:t>
+                            </m:r>
+                          </m:e>
+                          <m:sub>
+                            <m:r>
+                              <w:rPr>
+                                <w:rFonts w:ascii="Cambria Math" w:hAnsi="Cambria Math"/>
+                              </w:rPr>
+                              <m:t>c</m:t>
+                            </m:r>
+                          </m:sub>
+                        </m:sSub>
+                      </m:e>
+                    </m:d>
+                  </m:e>
+                  <m:sup>
+                    <m:r>
+                      <w:rPr>
+                        <w:rFonts w:ascii="Cambria Math" w:hAnsi="Cambria Math"/>
+                      </w:rPr>
+                      <m:t>2</m:t>
+                    </m:r>
+                  </m:sup>
+                </m:sSup>
+                <m:ctrlPr>
+                  <w:rPr>
+                    <w:rFonts w:ascii="Cambria Math" w:hAnsi="Cambria Math"/>
+                    <w:i/>
+                    <w:iCs/>
+                  </w:rPr>
+                </m:ctrlPr>
+              </m:e>
+            </m:nary>
+          </m:e>
+        </m:rad>
+      </m:oMath>
+    </w:p>
+    <w:p>
+      <w:pPr>
+        <w:numPr>
+          <w:ilvl w:val="1"/>
+          <w:numId w:val="7"/>
+        </w:numPr>
+      </w:pPr>
+      <w:r>
+        <w:rPr>
+          <w:b/>
+          <w:bCs/>
+        </w:rPr>
+        <w:t>Ý nghĩa:</w:t>
+      </w:r>
+      <w:r>
+        <w:t xml:space="preserve"> Phản ánh độ tương phản màu sắc. Một chiếc lá có đốm rỗ hoặc có gân màu khác biệt rõ rệt sẽ có độ lệch chuẩn cao hơn lá đơn sắc.</w:t>
+      </w:r>
+    </w:p>
+    <w:p>
+      <w:pPr>
+        <w:numPr>
+          <w:ilvl w:val="0"/>
+          <w:numId w:val="7"/>
+        </w:numPr>
+      </w:pPr>
+      <w:r>
+        <w:rPr>
+          <w:b/>
+          <w:bCs/>
+        </w:rPr>
+        <w:t>3. Color Skewness (Độ xiên màu - Moment bậc 3):</w:t>
+      </w:r>
+    </w:p>
+    <w:p>
+      <w:pPr>
+        <w:numPr>
+          <w:ilvl w:val="1"/>
+          <w:numId w:val="7"/>
+        </w:numPr>
+      </w:pPr>
+      <w:r>
+        <w:rPr>
+          <w:b/>
+          <w:bCs/>
+        </w:rPr>
+        <w:t>Định nghĩa:</w:t>
+      </w:r>
+      <w:r>
+        <w:t xml:space="preserve"> Thể hiện độ bất đối xứng trong phân bố màu sắc.</w:t>
+      </w:r>
+    </w:p>
+    <w:p>
+      <w:pPr>
+        <w:numPr>
+          <w:ilvl w:val="1"/>
+          <w:numId w:val="7"/>
+        </w:numPr>
+      </w:pPr>
+      <w:r>
+        <w:rPr>
+          <w:b/>
+          <w:bCs/>
+        </w:rPr>
+        <w:t>Công thức:</w:t>
+      </w:r>
+      <w:r>
+        <w:t xml:space="preserve"> </w:t>
+      </w:r>
+      <m:oMath>
+        <m:sSub>
+          <m:sSubPr>
+            <m:ctrlPr>
+              <w:rPr>
+                <w:rFonts w:ascii="Cambria Math" w:hAnsi="Cambria Math"/>
+                <w:i/>
+                <w:iCs/>
+              </w:rPr>
+            </m:ctrlPr>
+          </m:sSubPr>
+          <m:e>
+            <m:r>
+              <w:rPr>
+                <w:rFonts w:ascii="Cambria Math" w:hAnsi="Cambria Math"/>
+              </w:rPr>
+              <m:t>s</m:t>
+            </m:r>
+          </m:e>
+          <m:sub>
+            <m:r>
+              <w:rPr>
+                <w:rFonts w:ascii="Cambria Math" w:hAnsi="Cambria Math"/>
+              </w:rPr>
+              <m:t>c</m:t>
+            </m:r>
+          </m:sub>
+        </m:sSub>
+        <m:r>
+          <w:rPr>
+            <w:rFonts w:ascii="Cambria Math" w:hAnsi="Cambria Math"/>
+          </w:rPr>
+          <m:t>=</m:t>
+        </m:r>
+        <m:rad>
+          <m:radPr>
+            <m:ctrlPr>
+              <w:rPr>
+                <w:rFonts w:ascii="Cambria Math" w:hAnsi="Cambria Math"/>
+                <w:iCs/>
+              </w:rPr>
+            </m:ctrlPr>
+          </m:radPr>
+          <m:deg>
+            <m:r>
+              <w:rPr>
+                <w:rFonts w:ascii="Cambria Math" w:hAnsi="Cambria Math"/>
+              </w:rPr>
+              <m:t>3</m:t>
+            </m:r>
+            <m:ctrlPr>
+              <w:rPr>
+                <w:rFonts w:ascii="Cambria Math" w:hAnsi="Cambria Math"/>
+                <w:i/>
+                <w:iCs/>
+              </w:rPr>
+            </m:ctrlPr>
+          </m:deg>
+          <m:e>
+            <m:f>
+              <m:fPr>
+                <m:ctrlPr>
+                  <w:rPr>
+                    <w:rFonts w:ascii="Cambria Math" w:hAnsi="Cambria Math"/>
+                    <w:iCs/>
+                  </w:rPr>
+                </m:ctrlPr>
+              </m:fPr>
+              <m:num>
+                <m:r>
+                  <w:rPr>
+                    <w:rFonts w:ascii="Cambria Math" w:hAnsi="Cambria Math"/>
+                  </w:rPr>
+                  <m:t>1</m:t>
+                </m:r>
+                <m:ctrlPr>
+                  <w:rPr>
+                    <w:rFonts w:ascii="Cambria Math" w:hAnsi="Cambria Math"/>
+                    <w:i/>
+                    <w:iCs/>
+                  </w:rPr>
+                </m:ctrlPr>
+              </m:num>
+              <m:den>
+                <m:r>
+                  <w:rPr>
+                    <w:rFonts w:ascii="Cambria Math" w:hAnsi="Cambria Math"/>
+                  </w:rPr>
+                  <m:t>N</m:t>
+                </m:r>
+                <m:ctrlPr>
+                  <w:rPr>
+                    <w:rFonts w:ascii="Cambria Math" w:hAnsi="Cambria Math"/>
+                    <w:i/>
+                    <w:iCs/>
+                  </w:rPr>
+                </m:ctrlPr>
+              </m:den>
+            </m:f>
+            <m:nary>
+              <m:naryPr>
+                <m:chr m:val="∑"/>
+                <m:ctrlPr>
+                  <w:rPr>
+                    <w:rFonts w:ascii="Cambria Math" w:hAnsi="Cambria Math"/>
+                    <w:iCs/>
+                  </w:rPr>
+                </m:ctrlPr>
+              </m:naryPr>
+              <m:sub>
+                <m:r>
+                  <w:rPr>
+                    <w:rFonts w:ascii="Cambria Math" w:hAnsi="Cambria Math"/>
+                  </w:rPr>
+                  <m:t>i=1</m:t>
+                </m:r>
+                <m:ctrlPr>
+                  <w:rPr>
+                    <w:rFonts w:ascii="Cambria Math" w:hAnsi="Cambria Math"/>
+                    <w:i/>
+                    <w:iCs/>
+                  </w:rPr>
+                </m:ctrlPr>
+              </m:sub>
+              <m:sup>
+                <m:r>
+                  <w:rPr>
+                    <w:rFonts w:ascii="Cambria Math" w:hAnsi="Cambria Math"/>
+                  </w:rPr>
+                  <m:t>N</m:t>
+                </m:r>
+                <m:ctrlPr>
+                  <w:rPr>
+                    <w:rFonts w:ascii="Cambria Math" w:hAnsi="Cambria Math"/>
+                    <w:i/>
+                    <w:iCs/>
+                  </w:rPr>
+                </m:ctrlPr>
+              </m:sup>
+              <m:e>
+                <m:sSup>
+                  <m:sSupPr>
+                    <m:ctrlPr>
+                      <w:rPr>
+                        <w:rFonts w:ascii="Cambria Math" w:hAnsi="Cambria Math"/>
+                        <w:i/>
+                        <w:iCs/>
+                      </w:rPr>
+                    </m:ctrlPr>
+                  </m:sSupPr>
+                  <m:e>
+                    <m:d>
+                      <m:dPr>
+                        <m:ctrlPr>
+                          <w:rPr>
+                            <w:rFonts w:ascii="Cambria Math" w:hAnsi="Cambria Math"/>
+                            <w:i/>
+                            <w:iCs/>
+                          </w:rPr>
+                        </m:ctrlPr>
+                      </m:dPr>
+                      <m:e>
+                        <m:sSub>
+                          <m:sSubPr>
+                            <m:ctrlPr>
+                              <w:rPr>
+                                <w:rFonts w:ascii="Cambria Math" w:hAnsi="Cambria Math"/>
+                                <w:i/>
+                                <w:iCs/>
+                              </w:rPr>
+                            </m:ctrlPr>
+                          </m:sSubPr>
+                          <m:e>
+                            <m:r>
+                              <w:rPr>
+                                <w:rFonts w:ascii="Cambria Math" w:hAnsi="Cambria Math"/>
+                              </w:rPr>
+                              <m:t>p</m:t>
+                            </m:r>
+                          </m:e>
+                          <m:sub>
+                            <m:r>
+                              <w:rPr>
+                                <w:rFonts w:ascii="Cambria Math" w:hAnsi="Cambria Math"/>
+                              </w:rPr>
+                              <m:t>i,c</m:t>
+                            </m:r>
+                          </m:sub>
+                        </m:sSub>
+                        <m:r>
+                          <w:rPr>
+                            <w:rFonts w:ascii="Cambria Math" w:hAnsi="Cambria Math"/>
+                          </w:rPr>
+                          <m:t>-</m:t>
+                        </m:r>
+                        <m:sSub>
+                          <m:sSubPr>
+                            <m:ctrlPr>
+                              <w:rPr>
+                                <w:rFonts w:ascii="Cambria Math" w:hAnsi="Cambria Math"/>
+                                <w:i/>
+                                <w:iCs/>
+                              </w:rPr>
+                            </m:ctrlPr>
+                          </m:sSubPr>
+                          <m:e>
+                            <m:r>
+                              <m:rPr>
+                                <m:sty m:val="p"/>
+                              </m:rPr>
+                              <w:rPr>
+                                <w:rFonts w:ascii="Cambria Math" w:hAnsi="Cambria Math"/>
+                              </w:rPr>
+                              <m:t>μ</m:t>
+                            </m:r>
+                          </m:e>
+                          <m:sub>
+                            <m:r>
+                              <w:rPr>
+                                <w:rFonts w:ascii="Cambria Math" w:hAnsi="Cambria Math"/>
+                              </w:rPr>
+                              <m:t>c</m:t>
+                            </m:r>
+                          </m:sub>
+                        </m:sSub>
+                      </m:e>
+                    </m:d>
+                  </m:e>
+                  <m:sup>
+                    <m:r>
+                      <w:rPr>
+                        <w:rFonts w:ascii="Cambria Math" w:hAnsi="Cambria Math"/>
+                      </w:rPr>
+                      <m:t>3</m:t>
+                    </m:r>
+                  </m:sup>
+                </m:sSup>
+                <m:ctrlPr>
+                  <w:rPr>
+                    <w:rFonts w:ascii="Cambria Math" w:hAnsi="Cambria Math"/>
+                    <w:i/>
+                    <w:iCs/>
+                  </w:rPr>
+                </m:ctrlPr>
+              </m:e>
+            </m:nary>
+            <m:ctrlPr>
+              <w:rPr>
+                <w:rFonts w:ascii="Cambria Math" w:hAnsi="Cambria Math"/>
+                <w:i/>
+                <w:iCs/>
+              </w:rPr>
+            </m:ctrlPr>
+          </m:e>
+        </m:rad>
+      </m:oMath>
+    </w:p>
+    <w:p>
+      <w:pPr>
+        <w:numPr>
+          <w:ilvl w:val="1"/>
+          <w:numId w:val="7"/>
+        </w:numPr>
+      </w:pPr>
+      <w:r>
+        <w:rPr>
+          <w:b/>
+          <w:bCs/>
+        </w:rPr>
+        <w:t>Ý nghĩa:</w:t>
+      </w:r>
+      <w:r>
+        <w:t xml:space="preserve"> Giúp phát hiện các dải màu thiểu số nhưng nổi bật trên lá (ví dụ: phần viền lá bị cháy nắng hoặc úa vàng).</w:t>
+      </w:r>
+    </w:p>
+    <w:p>
+      <w:pPr>
+        <w:rPr>
+          <w:b/>
+          <w:bCs/>
+        </w:rPr>
+      </w:pPr>
+      <w:r>
+        <w:rPr>
+          <w:b/>
+          <w:bCs/>
+        </w:rPr>
+        <w:t>Nhóm 2: Color Distribution (Phân bố màu sắc toàn cục)</w:t>
+      </w:r>
+    </w:p>
+    <w:p>
+      <w:pPr>
+        <w:numPr>
+          <w:ilvl w:val="0"/>
+          <w:numId w:val="8"/>
+        </w:numPr>
+      </w:pPr>
+      <w:r>
+        <w:rPr>
+          <w:b/>
+          <w:bCs/>
+        </w:rPr>
+        <w:t>4. Color Histogram (Biểu đồ tần suất màu):</w:t>
+      </w:r>
+      <w:r>
+        <w:t xml:space="preserve"> * </w:t>
+      </w:r>
+      <w:r>
+        <w:rPr>
+          <w:b/>
+          <w:bCs/>
+        </w:rPr>
+        <w:t>Ý nghĩa:</w:t>
+      </w:r>
+      <w:r>
+        <w:t xml:space="preserve"> Biểu diễn số lượng pixel rơi vào các "bin" (khoảng màu) nhất định. Đây là đặc trưng truyền thống mạnh mẽ nhất vì nó hoàn toàn bất biến với phép xoay, lật và phép tịnh tiến ảnh.</w:t>
+      </w:r>
+    </w:p>
+    <w:p>
+      <w:pPr>
+        <w:numPr>
+          <w:ilvl w:val="1"/>
+          <w:numId w:val="8"/>
+        </w:numPr>
+      </w:pPr>
+      <w:r>
+        <w:rPr>
+          <w:b/>
+          <w:bCs/>
+        </w:rPr>
+        <w:t>Cách làm:</w:t>
+      </w:r>
+      <w:r>
+        <w:t xml:space="preserve"> Bạn nên lượng tử hóa không gian HSV (ví dụ: Hue 8 bins, Saturation 4 bins, Value 4 bins) để tạo ra một vector đặc trưng 1D (kích thước </w:t>
+      </w:r>
+      <m:oMath>
+        <m:r>
+          <w:rPr>
+            <w:rFonts w:ascii="Cambria Math" w:hAnsi="Cambria Math"/>
+          </w:rPr>
+          <m:t xml:space="preserve">8 </m:t>
+        </m:r>
+        <m:r>
+          <m:rPr>
+            <m:sty m:val="p"/>
+          </m:rPr>
+          <w:rPr>
+            <w:rFonts w:ascii="Cambria Math" w:hAnsi="Cambria Math"/>
+          </w:rPr>
+          <m:t>×</m:t>
+        </m:r>
+        <m:r>
+          <w:rPr>
+            <w:rFonts w:ascii="Cambria Math" w:hAnsi="Cambria Math"/>
+          </w:rPr>
+          <m:t xml:space="preserve">4 </m:t>
+        </m:r>
+        <m:r>
+          <m:rPr>
+            <m:sty m:val="p"/>
+          </m:rPr>
+          <w:rPr>
+            <w:rFonts w:ascii="Cambria Math" w:hAnsi="Cambria Math"/>
+          </w:rPr>
+          <m:t>×</m:t>
+        </m:r>
+        <m:r>
+          <w:rPr>
+            <w:rFonts w:ascii="Cambria Math" w:hAnsi="Cambria Math"/>
+          </w:rPr>
+          <m:t>4 = 128</m:t>
+        </m:r>
+      </m:oMath>
+      <w:r>
+        <w:t xml:space="preserve"> chiều).</w:t>
+      </w:r>
+    </w:p>
+    <w:p>
+      <w:pPr>
+        <w:numPr>
+          <w:ilvl w:val="0"/>
+          <w:numId w:val="8"/>
+        </w:numPr>
+      </w:pPr>
+      <w:r>
+        <w:rPr>
+          <w:b/>
+          <w:bCs/>
+        </w:rPr>
+        <w:t>5. Dominant Color(s) (Các màu chủ đạo):</w:t>
+      </w:r>
+    </w:p>
+    <w:p>
+      <w:pPr>
+        <w:numPr>
+          <w:ilvl w:val="1"/>
+          <w:numId w:val="8"/>
+        </w:numPr>
+      </w:pPr>
+      <w:r>
+        <w:rPr>
+          <w:b/>
+          <w:bCs/>
+        </w:rPr>
+        <w:t>Ý nghĩa:</w:t>
+      </w:r>
+      <w:r>
+        <w:t xml:space="preserve"> Thay vì lấy toàn bộ phân phối như Histogram, tham số này chỉ tập trung vào 2-3 màu sắc chiếm diện tích lớn nhất trên lá.</w:t>
+      </w:r>
+    </w:p>
+    <w:p>
+      <w:pPr>
+        <w:numPr>
+          <w:ilvl w:val="1"/>
+          <w:numId w:val="8"/>
+        </w:numPr>
+      </w:pPr>
+      <w:r>
+        <w:rPr>
+          <w:b/>
+          <w:bCs/>
+        </w:rPr>
+        <w:t>Cách làm:</w:t>
+      </w:r>
+      <w:r>
+        <w:t xml:space="preserve"> Sử dụng thuật toán phân cụm K-Means (</w:t>
+      </w:r>
+      <w:r>
+        <w:rPr>
+          <w:lang w:val="vi-VN"/>
+        </w:rPr>
+        <w:t xml:space="preserve"> </w:t>
+      </w:r>
+      <m:oMath>
+        <m:r>
+          <w:rPr>
+            <w:rFonts w:ascii="Cambria Math" w:hAnsi="Cambria Math"/>
+          </w:rPr>
+          <m:t>K=2</m:t>
+        </m:r>
+      </m:oMath>
+      <w:r>
+        <w:t xml:space="preserve"> hoặc </w:t>
+      </w:r>
+      <m:oMath>
+        <m:r>
+          <w:rPr>
+            <w:rFonts w:ascii="Cambria Math" w:hAnsi="Cambria Math"/>
+          </w:rPr>
+          <m:t>3</m:t>
+        </m:r>
+      </m:oMath>
+      <w:r>
+        <w:rPr>
+          <w:lang w:val="vi-VN"/>
+        </w:rPr>
+        <w:t xml:space="preserve"> </w:t>
+      </w:r>
+      <w:r>
+        <w:t>) trên các pixel để tìm ra các centroid (tâm cụm) màu sắc đại diện.</w:t>
+      </w:r>
+    </w:p>
+    <w:p>
+      <w:pPr>
+        <w:rPr>
+          <w:b/>
+          <w:bCs/>
+        </w:rPr>
+      </w:pPr>
+      <w:r>
+        <w:rPr>
+          <w:b/>
+          <w:bCs/>
+        </w:rPr>
+        <w:t>Nhóm 3: Color Spatial (Không gian &amp; Bố cục màu sắc)</w:t>
+      </w:r>
+    </w:p>
+    <w:p>
+      <w:r>
+        <w:t>Nhược điểm của Histogram là không biết màu sắc nằm ở đâu (hai lá có cùng tỷ lệ màu xanh/vàng nhưng một lá viền vàng, một lá đốm vàng sẽ có Histogram giống nhau). Các tham số sau giải quyết điều này:</w:t>
+      </w:r>
+    </w:p>
+    <w:p>
+      <w:pPr>
+        <w:numPr>
+          <w:ilvl w:val="0"/>
+          <w:numId w:val="9"/>
+        </w:numPr>
+      </w:pPr>
+      <w:r>
+        <w:rPr>
+          <w:b/>
+          <w:bCs/>
+        </w:rPr>
+        <w:t>6. Color Auto-Correlogram (Biểu đồ tự tương quan màu):</w:t>
+      </w:r>
+    </w:p>
+    <w:p>
+      <w:pPr>
+        <w:numPr>
+          <w:ilvl w:val="1"/>
+          <w:numId w:val="9"/>
+        </w:numPr>
+      </w:pPr>
+      <w:r>
+        <w:rPr>
+          <w:b/>
+          <w:bCs/>
+        </w:rPr>
+        <w:lastRenderedPageBreak/>
+        <w:t>Ý nghĩa:</w:t>
+      </w:r>
+      <w:r>
+        <w:t xml:space="preserve"> Biểu diễn xác suất tìm thấy 2 pixel cùng màu ở một khoảng cách </w:t>
+      </w:r>
+      <m:oMath>
+        <m:r>
+          <w:rPr>
+            <w:rFonts w:ascii="Cambria Math" w:hAnsi="Cambria Math"/>
+          </w:rPr>
+          <m:t>d</m:t>
+        </m:r>
+      </m:oMath>
+      <w:r>
+        <w:t xml:space="preserve"> xác định.</w:t>
+      </w:r>
+    </w:p>
+    <w:p>
+      <w:pPr>
+        <w:numPr>
+          <w:ilvl w:val="1"/>
+          <w:numId w:val="9"/>
+        </w:numPr>
+      </w:pPr>
+      <w:r>
+        <w:rPr>
+          <w:b/>
+          <w:bCs/>
+        </w:rPr>
+        <w:t>Giá trị:</w:t>
+      </w:r>
+      <w:r>
+        <w:t xml:space="preserve"> Cực kỳ nhạy bén trong việc phân biệt các mẫu (pattern) màu sắc trên lá (ví dụ: gân lá khác màu chạy song song hay hình mạng nhện).</w:t>
+      </w:r>
+    </w:p>
+    <w:p>
+      <w:pPr>
+        <w:numPr>
+          <w:ilvl w:val="0"/>
+          <w:numId w:val="9"/>
+        </w:numPr>
+      </w:pPr>
+      <w:r>
+        <w:rPr>
+          <w:b/>
+          <w:bCs/>
+        </w:rPr>
+        <w:t>7. Color Coherence Vector - CCV (Vector kết dính màu):</w:t>
+      </w:r>
+    </w:p>
+    <w:p>
+      <w:pPr>
+        <w:numPr>
+          <w:ilvl w:val="1"/>
+          <w:numId w:val="9"/>
+        </w:numPr>
+      </w:pPr>
+      <w:r>
+        <w:rPr>
+          <w:b/>
+          <w:bCs/>
+        </w:rPr>
+        <w:t>Ý nghĩa:</w:t>
+      </w:r>
+      <w:r>
+        <w:t xml:space="preserve"> CCV phân loại các pixel trong Histogram thành 2 nhóm: "Coherent" (thuộc một vùng màu đồng nhất lớn) và "Incoherent" (các điểm màu nhỏ lẻ, nhiễu).</w:t>
+      </w:r>
+    </w:p>
+    <w:p>
+      <w:pPr>
+        <w:numPr>
+          <w:ilvl w:val="1"/>
+          <w:numId w:val="9"/>
+        </w:numPr>
+      </w:pPr>
+      <w:r>
+        <w:rPr>
+          <w:b/>
+          <w:bCs/>
+        </w:rPr>
+        <w:t>Giá trị:</w:t>
+      </w:r>
+      <w:r>
+        <w:t xml:space="preserve"> Giúp hệ thống phân biệt được những chiếc lá có mảng màu úa lớn so với những chiếc lá bị lốm đốm màu nhỏ giọt, dù tổng diện tích vùng úa là bằng nhau.</w:t>
       </w:r>
     </w:p>
     <w:p/>
@@ -2294,6 +3684,453 @@
     </w:lvl>
   </w:abstractNum>
   <w:abstractNum w:abstractNumId="5" w15:restartNumberingAfterBreak="0">
+    <w:nsid w:val="4CD300E4"/>
+    <w:multiLevelType w:val="multilevel"/>
+    <w:tmpl w:val="CAB4D220"/>
+    <w:lvl w:ilvl="0">
+      <w:start w:val="1"/>
+      <w:numFmt w:val="bullet"/>
+      <w:lvlText w:val=""/>
+      <w:lvlJc w:val="left"/>
+      <w:pPr>
+        <w:tabs>
+          <w:tab w:val="num" w:pos="720"/>
+        </w:tabs>
+        <w:ind w:left="720" w:hanging="360"/>
+      </w:pPr>
+      <w:rPr>
+        <w:rFonts w:ascii="Symbol" w:hAnsi="Symbol" w:hint="default"/>
+        <w:sz w:val="20"/>
+      </w:rPr>
+    </w:lvl>
+    <w:lvl w:ilvl="1">
+      <w:start w:val="1"/>
+      <w:numFmt w:val="bullet"/>
+      <w:lvlText w:val="o"/>
+      <w:lvlJc w:val="left"/>
+      <w:pPr>
+        <w:tabs>
+          <w:tab w:val="num" w:pos="1440"/>
+        </w:tabs>
+        <w:ind w:left="1440" w:hanging="360"/>
+      </w:pPr>
+      <w:rPr>
+        <w:rFonts w:ascii="Courier New" w:hAnsi="Courier New" w:hint="default"/>
+        <w:sz w:val="20"/>
+      </w:rPr>
+    </w:lvl>
+    <w:lvl w:ilvl="2" w:tentative="1">
+      <w:start w:val="1"/>
+      <w:numFmt w:val="bullet"/>
+      <w:lvlText w:val=""/>
+      <w:lvlJc w:val="left"/>
+      <w:pPr>
+        <w:tabs>
+          <w:tab w:val="num" w:pos="2160"/>
+        </w:tabs>
+        <w:ind w:left="2160" w:hanging="360"/>
+      </w:pPr>
+      <w:rPr>
+        <w:rFonts w:ascii="Wingdings" w:hAnsi="Wingdings" w:hint="default"/>
+        <w:sz w:val="20"/>
+      </w:rPr>
+    </w:lvl>
+    <w:lvl w:ilvl="3" w:tentative="1">
+      <w:start w:val="1"/>
+      <w:numFmt w:val="bullet"/>
+      <w:lvlText w:val=""/>
+      <w:lvlJc w:val="left"/>
+      <w:pPr>
+        <w:tabs>
+          <w:tab w:val="num" w:pos="2880"/>
+        </w:tabs>
+        <w:ind w:left="2880" w:hanging="360"/>
+      </w:pPr>
+      <w:rPr>
+        <w:rFonts w:ascii="Wingdings" w:hAnsi="Wingdings" w:hint="default"/>
+        <w:sz w:val="20"/>
+      </w:rPr>
+    </w:lvl>
+    <w:lvl w:ilvl="4" w:tentative="1">
+      <w:start w:val="1"/>
+      <w:numFmt w:val="bullet"/>
+      <w:lvlText w:val=""/>
+      <w:lvlJc w:val="left"/>
+      <w:pPr>
+        <w:tabs>
+          <w:tab w:val="num" w:pos="3600"/>
+        </w:tabs>
+        <w:ind w:left="3600" w:hanging="360"/>
+      </w:pPr>
+      <w:rPr>
+        <w:rFonts w:ascii="Wingdings" w:hAnsi="Wingdings" w:hint="default"/>
+        <w:sz w:val="20"/>
+      </w:rPr>
+    </w:lvl>
+    <w:lvl w:ilvl="5" w:tentative="1">
+      <w:start w:val="1"/>
+      <w:numFmt w:val="bullet"/>
+      <w:lvlText w:val=""/>
+      <w:lvlJc w:val="left"/>
+      <w:pPr>
+        <w:tabs>
+          <w:tab w:val="num" w:pos="4320"/>
+        </w:tabs>
+        <w:ind w:left="4320" w:hanging="360"/>
+      </w:pPr>
+      <w:rPr>
+        <w:rFonts w:ascii="Wingdings" w:hAnsi="Wingdings" w:hint="default"/>
+        <w:sz w:val="20"/>
+      </w:rPr>
+    </w:lvl>
+    <w:lvl w:ilvl="6" w:tentative="1">
+      <w:start w:val="1"/>
+      <w:numFmt w:val="bullet"/>
+      <w:lvlText w:val=""/>
+      <w:lvlJc w:val="left"/>
+      <w:pPr>
+        <w:tabs>
+          <w:tab w:val="num" w:pos="5040"/>
+        </w:tabs>
+        <w:ind w:left="5040" w:hanging="360"/>
+      </w:pPr>
+      <w:rPr>
+        <w:rFonts w:ascii="Wingdings" w:hAnsi="Wingdings" w:hint="default"/>
+        <w:sz w:val="20"/>
+      </w:rPr>
+    </w:lvl>
+    <w:lvl w:ilvl="7" w:tentative="1">
+      <w:start w:val="1"/>
+      <w:numFmt w:val="bullet"/>
+      <w:lvlText w:val=""/>
+      <w:lvlJc w:val="left"/>
+      <w:pPr>
+        <w:tabs>
+          <w:tab w:val="num" w:pos="5760"/>
+        </w:tabs>
+        <w:ind w:left="5760" w:hanging="360"/>
+      </w:pPr>
+      <w:rPr>
+        <w:rFonts w:ascii="Wingdings" w:hAnsi="Wingdings" w:hint="default"/>
+        <w:sz w:val="20"/>
+      </w:rPr>
+    </w:lvl>
+    <w:lvl w:ilvl="8" w:tentative="1">
+      <w:start w:val="1"/>
+      <w:numFmt w:val="bullet"/>
+      <w:lvlText w:val=""/>
+      <w:lvlJc w:val="left"/>
+      <w:pPr>
+        <w:tabs>
+          <w:tab w:val="num" w:pos="6480"/>
+        </w:tabs>
+        <w:ind w:left="6480" w:hanging="360"/>
+      </w:pPr>
+      <w:rPr>
+        <w:rFonts w:ascii="Wingdings" w:hAnsi="Wingdings" w:hint="default"/>
+        <w:sz w:val="20"/>
+      </w:rPr>
+    </w:lvl>
+  </w:abstractNum>
+  <w:abstractNum w:abstractNumId="6" w15:restartNumberingAfterBreak="0">
+    <w:nsid w:val="4EB82E97"/>
+    <w:multiLevelType w:val="multilevel"/>
+    <w:tmpl w:val="43F6C638"/>
+    <w:lvl w:ilvl="0">
+      <w:start w:val="1"/>
+      <w:numFmt w:val="bullet"/>
+      <w:lvlText w:val=""/>
+      <w:lvlJc w:val="left"/>
+      <w:pPr>
+        <w:tabs>
+          <w:tab w:val="num" w:pos="720"/>
+        </w:tabs>
+        <w:ind w:left="720" w:hanging="360"/>
+      </w:pPr>
+      <w:rPr>
+        <w:rFonts w:ascii="Symbol" w:hAnsi="Symbol" w:hint="default"/>
+        <w:sz w:val="20"/>
+      </w:rPr>
+    </w:lvl>
+    <w:lvl w:ilvl="1">
+      <w:start w:val="1"/>
+      <w:numFmt w:val="bullet"/>
+      <w:lvlText w:val="o"/>
+      <w:lvlJc w:val="left"/>
+      <w:pPr>
+        <w:tabs>
+          <w:tab w:val="num" w:pos="1440"/>
+        </w:tabs>
+        <w:ind w:left="1440" w:hanging="360"/>
+      </w:pPr>
+      <w:rPr>
+        <w:rFonts w:ascii="Courier New" w:hAnsi="Courier New" w:hint="default"/>
+        <w:sz w:val="20"/>
+      </w:rPr>
+    </w:lvl>
+    <w:lvl w:ilvl="2" w:tentative="1">
+      <w:start w:val="1"/>
+      <w:numFmt w:val="bullet"/>
+      <w:lvlText w:val=""/>
+      <w:lvlJc w:val="left"/>
+      <w:pPr>
+        <w:tabs>
+          <w:tab w:val="num" w:pos="2160"/>
+        </w:tabs>
+        <w:ind w:left="2160" w:hanging="360"/>
+      </w:pPr>
+      <w:rPr>
+        <w:rFonts w:ascii="Wingdings" w:hAnsi="Wingdings" w:hint="default"/>
+        <w:sz w:val="20"/>
+      </w:rPr>
+    </w:lvl>
+    <w:lvl w:ilvl="3" w:tentative="1">
+      <w:start w:val="1"/>
+      <w:numFmt w:val="bullet"/>
+      <w:lvlText w:val=""/>
+      <w:lvlJc w:val="left"/>
+      <w:pPr>
+        <w:tabs>
+          <w:tab w:val="num" w:pos="2880"/>
+        </w:tabs>
+        <w:ind w:left="2880" w:hanging="360"/>
+      </w:pPr>
+      <w:rPr>
+        <w:rFonts w:ascii="Wingdings" w:hAnsi="Wingdings" w:hint="default"/>
+        <w:sz w:val="20"/>
+      </w:rPr>
+    </w:lvl>
+    <w:lvl w:ilvl="4" w:tentative="1">
+      <w:start w:val="1"/>
+      <w:numFmt w:val="bullet"/>
+      <w:lvlText w:val=""/>
+      <w:lvlJc w:val="left"/>
+      <w:pPr>
+        <w:tabs>
+          <w:tab w:val="num" w:pos="3600"/>
+        </w:tabs>
+        <w:ind w:left="3600" w:hanging="360"/>
+      </w:pPr>
+      <w:rPr>
+        <w:rFonts w:ascii="Wingdings" w:hAnsi="Wingdings" w:hint="default"/>
+        <w:sz w:val="20"/>
+      </w:rPr>
+    </w:lvl>
+    <w:lvl w:ilvl="5" w:tentative="1">
+      <w:start w:val="1"/>
+      <w:numFmt w:val="bullet"/>
+      <w:lvlText w:val=""/>
+      <w:lvlJc w:val="left"/>
+      <w:pPr>
+        <w:tabs>
+          <w:tab w:val="num" w:pos="4320"/>
+        </w:tabs>
+        <w:ind w:left="4320" w:hanging="360"/>
+      </w:pPr>
+      <w:rPr>
+        <w:rFonts w:ascii="Wingdings" w:hAnsi="Wingdings" w:hint="default"/>
+        <w:sz w:val="20"/>
+      </w:rPr>
+    </w:lvl>
+    <w:lvl w:ilvl="6" w:tentative="1">
+      <w:start w:val="1"/>
+      <w:numFmt w:val="bullet"/>
+      <w:lvlText w:val=""/>
+      <w:lvlJc w:val="left"/>
+      <w:pPr>
+        <w:tabs>
+          <w:tab w:val="num" w:pos="5040"/>
+        </w:tabs>
+        <w:ind w:left="5040" w:hanging="360"/>
+      </w:pPr>
+      <w:rPr>
+        <w:rFonts w:ascii="Wingdings" w:hAnsi="Wingdings" w:hint="default"/>
+        <w:sz w:val="20"/>
+      </w:rPr>
+    </w:lvl>
+    <w:lvl w:ilvl="7" w:tentative="1">
+      <w:start w:val="1"/>
+      <w:numFmt w:val="bullet"/>
+      <w:lvlText w:val=""/>
+      <w:lvlJc w:val="left"/>
+      <w:pPr>
+        <w:tabs>
+          <w:tab w:val="num" w:pos="5760"/>
+        </w:tabs>
+        <w:ind w:left="5760" w:hanging="360"/>
+      </w:pPr>
+      <w:rPr>
+        <w:rFonts w:ascii="Wingdings" w:hAnsi="Wingdings" w:hint="default"/>
+        <w:sz w:val="20"/>
+      </w:rPr>
+    </w:lvl>
+    <w:lvl w:ilvl="8" w:tentative="1">
+      <w:start w:val="1"/>
+      <w:numFmt w:val="bullet"/>
+      <w:lvlText w:val=""/>
+      <w:lvlJc w:val="left"/>
+      <w:pPr>
+        <w:tabs>
+          <w:tab w:val="num" w:pos="6480"/>
+        </w:tabs>
+        <w:ind w:left="6480" w:hanging="360"/>
+      </w:pPr>
+      <w:rPr>
+        <w:rFonts w:ascii="Wingdings" w:hAnsi="Wingdings" w:hint="default"/>
+        <w:sz w:val="20"/>
+      </w:rPr>
+    </w:lvl>
+  </w:abstractNum>
+  <w:abstractNum w:abstractNumId="7" w15:restartNumberingAfterBreak="0">
+    <w:nsid w:val="51265B3E"/>
+    <w:multiLevelType w:val="multilevel"/>
+    <w:tmpl w:val="20CED3EA"/>
+    <w:lvl w:ilvl="0">
+      <w:start w:val="1"/>
+      <w:numFmt w:val="bullet"/>
+      <w:lvlText w:val=""/>
+      <w:lvlJc w:val="left"/>
+      <w:pPr>
+        <w:tabs>
+          <w:tab w:val="num" w:pos="720"/>
+        </w:tabs>
+        <w:ind w:left="720" w:hanging="360"/>
+      </w:pPr>
+      <w:rPr>
+        <w:rFonts w:ascii="Symbol" w:hAnsi="Symbol" w:hint="default"/>
+        <w:sz w:val="20"/>
+      </w:rPr>
+    </w:lvl>
+    <w:lvl w:ilvl="1">
+      <w:start w:val="1"/>
+      <w:numFmt w:val="bullet"/>
+      <w:lvlText w:val="o"/>
+      <w:lvlJc w:val="left"/>
+      <w:pPr>
+        <w:tabs>
+          <w:tab w:val="num" w:pos="1440"/>
+        </w:tabs>
+        <w:ind w:left="1440" w:hanging="360"/>
+      </w:pPr>
+      <w:rPr>
+        <w:rFonts w:ascii="Courier New" w:hAnsi="Courier New" w:hint="default"/>
+        <w:sz w:val="20"/>
+      </w:rPr>
+    </w:lvl>
+    <w:lvl w:ilvl="2" w:tentative="1">
+      <w:start w:val="1"/>
+      <w:numFmt w:val="bullet"/>
+      <w:lvlText w:val=""/>
+      <w:lvlJc w:val="left"/>
+      <w:pPr>
+        <w:tabs>
+          <w:tab w:val="num" w:pos="2160"/>
+        </w:tabs>
+        <w:ind w:left="2160" w:hanging="360"/>
+      </w:pPr>
+      <w:rPr>
+        <w:rFonts w:ascii="Wingdings" w:hAnsi="Wingdings" w:hint="default"/>
+        <w:sz w:val="20"/>
+      </w:rPr>
+    </w:lvl>
+    <w:lvl w:ilvl="3" w:tentative="1">
+      <w:start w:val="1"/>
+      <w:numFmt w:val="bullet"/>
+      <w:lvlText w:val=""/>
+      <w:lvlJc w:val="left"/>
+      <w:pPr>
+        <w:tabs>
+          <w:tab w:val="num" w:pos="2880"/>
+        </w:tabs>
+        <w:ind w:left="2880" w:hanging="360"/>
+      </w:pPr>
+      <w:rPr>
+        <w:rFonts w:ascii="Wingdings" w:hAnsi="Wingdings" w:hint="default"/>
+        <w:sz w:val="20"/>
+      </w:rPr>
+    </w:lvl>
+    <w:lvl w:ilvl="4" w:tentative="1">
+      <w:start w:val="1"/>
+      <w:numFmt w:val="bullet"/>
+      <w:lvlText w:val=""/>
+      <w:lvlJc w:val="left"/>
+      <w:pPr>
+        <w:tabs>
+          <w:tab w:val="num" w:pos="3600"/>
+        </w:tabs>
+        <w:ind w:left="3600" w:hanging="360"/>
+      </w:pPr>
+      <w:rPr>
+        <w:rFonts w:ascii="Wingdings" w:hAnsi="Wingdings" w:hint="default"/>
+        <w:sz w:val="20"/>
+      </w:rPr>
+    </w:lvl>
+    <w:lvl w:ilvl="5" w:tentative="1">
+      <w:start w:val="1"/>
+      <w:numFmt w:val="bullet"/>
+      <w:lvlText w:val=""/>
+      <w:lvlJc w:val="left"/>
+      <w:pPr>
+        <w:tabs>
+          <w:tab w:val="num" w:pos="4320"/>
+        </w:tabs>
+        <w:ind w:left="4320" w:hanging="360"/>
+      </w:pPr>
+      <w:rPr>
+        <w:rFonts w:ascii="Wingdings" w:hAnsi="Wingdings" w:hint="default"/>
+        <w:sz w:val="20"/>
+      </w:rPr>
+    </w:lvl>
+    <w:lvl w:ilvl="6" w:tentative="1">
+      <w:start w:val="1"/>
+      <w:numFmt w:val="bullet"/>
+      <w:lvlText w:val=""/>
+      <w:lvlJc w:val="left"/>
+      <w:pPr>
+        <w:tabs>
+          <w:tab w:val="num" w:pos="5040"/>
+        </w:tabs>
+        <w:ind w:left="5040" w:hanging="360"/>
+      </w:pPr>
+      <w:rPr>
+        <w:rFonts w:ascii="Wingdings" w:hAnsi="Wingdings" w:hint="default"/>
+        <w:sz w:val="20"/>
+      </w:rPr>
+    </w:lvl>
+    <w:lvl w:ilvl="7" w:tentative="1">
+      <w:start w:val="1"/>
+      <w:numFmt w:val="bullet"/>
+      <w:lvlText w:val=""/>
+      <w:lvlJc w:val="left"/>
+      <w:pPr>
+        <w:tabs>
+          <w:tab w:val="num" w:pos="5760"/>
+        </w:tabs>
+        <w:ind w:left="5760" w:hanging="360"/>
+      </w:pPr>
+      <w:rPr>
+        <w:rFonts w:ascii="Wingdings" w:hAnsi="Wingdings" w:hint="default"/>
+        <w:sz w:val="20"/>
+      </w:rPr>
+    </w:lvl>
+    <w:lvl w:ilvl="8" w:tentative="1">
+      <w:start w:val="1"/>
+      <w:numFmt w:val="bullet"/>
+      <w:lvlText w:val=""/>
+      <w:lvlJc w:val="left"/>
+      <w:pPr>
+        <w:tabs>
+          <w:tab w:val="num" w:pos="6480"/>
+        </w:tabs>
+        <w:ind w:left="6480" w:hanging="360"/>
+      </w:pPr>
+      <w:rPr>
+        <w:rFonts w:ascii="Wingdings" w:hAnsi="Wingdings" w:hint="default"/>
+        <w:sz w:val="20"/>
+      </w:rPr>
+    </w:lvl>
+  </w:abstractNum>
+  <w:abstractNum w:abstractNumId="8" w15:restartNumberingAfterBreak="0">
     <w:nsid w:val="63A44BC2"/>
     <w:multiLevelType w:val="multilevel"/>
     <w:tmpl w:val="526687E6"/>
@@ -2458,7 +4295,16 @@
     <w:abstractNumId w:val="2"/>
   </w:num>
   <w:num w:numId="6" w16cid:durableId="1897857147">
+    <w:abstractNumId w:val="8"/>
+  </w:num>
+  <w:num w:numId="7" w16cid:durableId="1722484194">
     <w:abstractNumId w:val="5"/>
+  </w:num>
+  <w:num w:numId="8" w16cid:durableId="106892336">
+    <w:abstractNumId w:val="6"/>
+  </w:num>
+  <w:num w:numId="9" w16cid:durableId="606277589">
+    <w:abstractNumId w:val="7"/>
   </w:num>
 </w:numbering>
 </file>
@@ -2890,25 +4736,18 @@
   </w:style>
   <w:style w:type="paragraph" w:styleId="Heading2">
     <w:name w:val="heading 2"/>
-    <w:basedOn w:val="Normal"/>
+    <w:basedOn w:val="Heading1"/>
     <w:next w:val="Normal"/>
     <w:link w:val="Heading2Char"/>
     <w:uiPriority w:val="9"/>
-    <w:semiHidden/>
     <w:unhideWhenUsed/>
     <w:qFormat/>
-    <w:rsid w:val="00802604"/>
+    <w:rsid w:val="00EF581D"/>
     <w:pPr>
-      <w:keepNext/>
-      <w:keepLines/>
-      <w:spacing w:before="160" w:after="80"/>
       <w:outlineLvl w:val="1"/>
     </w:pPr>
     <w:rPr>
-      <w:rFonts w:asciiTheme="majorHAnsi" w:eastAsiaTheme="majorEastAsia" w:hAnsiTheme="majorHAnsi" w:cstheme="majorBidi"/>
-      <w:color w:val="0F4761" w:themeColor="accent1" w:themeShade="BF"/>
-      <w:sz w:val="32"/>
-      <w:szCs w:val="32"/>
+      <w:lang w:val="vi-VN"/>
     </w:rPr>
   </w:style>
   <w:style w:type="paragraph" w:styleId="Heading3">
@@ -3110,13 +4949,15 @@
     <w:basedOn w:val="DefaultParagraphFont"/>
     <w:link w:val="Heading2"/>
     <w:uiPriority w:val="9"/>
-    <w:semiHidden/>
-    <w:rsid w:val="00802604"/>
+    <w:rsid w:val="00EF581D"/>
     <w:rPr>
-      <w:rFonts w:asciiTheme="majorHAnsi" w:eastAsiaTheme="majorEastAsia" w:hAnsiTheme="majorHAnsi" w:cstheme="majorBidi"/>
-      <w:color w:val="0F4761" w:themeColor="accent1" w:themeShade="BF"/>
+      <w:rFonts w:eastAsiaTheme="majorEastAsia"/>
+      <w:b/>
+      <w:bCs/>
+      <w:color w:val="000000" w:themeColor="text1"/>
       <w:sz w:val="32"/>
       <w:szCs w:val="32"/>
+      <w:lang w:val="vi-VN"/>
     </w:rPr>
   </w:style>
   <w:style w:type="character" w:customStyle="1" w:styleId="Heading3Char">
@@ -3374,6 +5215,61 @@
       <w:smallCaps/>
       <w:color w:val="0F4761" w:themeColor="accent1" w:themeShade="BF"/>
       <w:spacing w:val="5"/>
+    </w:rPr>
+  </w:style>
+  <w:style w:type="paragraph" w:styleId="TOCHeading">
+    <w:name w:val="TOC Heading"/>
+    <w:basedOn w:val="Heading1"/>
+    <w:next w:val="Normal"/>
+    <w:uiPriority w:val="39"/>
+    <w:unhideWhenUsed/>
+    <w:qFormat/>
+    <w:rsid w:val="00EF581D"/>
+    <w:pPr>
+      <w:spacing w:before="240" w:after="0"/>
+      <w:outlineLvl w:val="9"/>
+    </w:pPr>
+    <w:rPr>
+      <w:rFonts w:asciiTheme="majorHAnsi" w:hAnsiTheme="majorHAnsi" w:cstheme="majorBidi"/>
+      <w:b w:val="0"/>
+      <w:bCs w:val="0"/>
+      <w:color w:val="0F4761" w:themeColor="accent1" w:themeShade="BF"/>
+      <w:kern w:val="0"/>
+      <w:lang w:eastAsia="en-US"/>
+      <w14:ligatures w14:val="none"/>
+    </w:rPr>
+  </w:style>
+  <w:style w:type="paragraph" w:styleId="TOC1">
+    <w:name w:val="toc 1"/>
+    <w:basedOn w:val="Normal"/>
+    <w:next w:val="Normal"/>
+    <w:autoRedefine/>
+    <w:uiPriority w:val="39"/>
+    <w:unhideWhenUsed/>
+    <w:rsid w:val="00EF581D"/>
+    <w:pPr>
+      <w:spacing w:after="100"/>
+    </w:pPr>
+  </w:style>
+  <w:style w:type="character" w:styleId="Hyperlink">
+    <w:name w:val="Hyperlink"/>
+    <w:basedOn w:val="DefaultParagraphFont"/>
+    <w:uiPriority w:val="99"/>
+    <w:unhideWhenUsed/>
+    <w:rsid w:val="00EF581D"/>
+    <w:rPr>
+      <w:color w:val="467886" w:themeColor="hyperlink"/>
+      <w:u w:val="single"/>
+    </w:rPr>
+  </w:style>
+  <w:style w:type="character" w:styleId="PlaceholderText">
+    <w:name w:val="Placeholder Text"/>
+    <w:basedOn w:val="DefaultParagraphFont"/>
+    <w:uiPriority w:val="99"/>
+    <w:semiHidden/>
+    <w:rsid w:val="001229D0"/>
+    <w:rPr>
+      <w:color w:val="666666"/>
     </w:rPr>
   </w:style>
 </w:styles>
@@ -3672,4 +5568,16 @@
     </a:ext>
   </a:extLst>
 </a:theme>
+</file>
+
+<file path=customXml/item1.xml><?xml version="1.0" encoding="utf-8"?>
+<b:Sources xmlns:b="http://schemas.openxmlformats.org/officeDocument/2006/bibliography" xmlns="http://schemas.openxmlformats.org/officeDocument/2006/bibliography" SelectedStyle="\APASixthEditionOfficeOnline.xsl" StyleName="APA" Version="6"/>
+</file>
+
+<file path=customXml/itemProps1.xml><?xml version="1.0" encoding="utf-8"?>
+<ds:datastoreItem xmlns:ds="http://schemas.openxmlformats.org/officeDocument/2006/customXml" ds:itemID="{31F4D039-96A2-4F65-8202-90F578174982}">
+  <ds:schemaRefs>
+    <ds:schemaRef ds:uri="http://schemas.openxmlformats.org/officeDocument/2006/bibliography"/>
+  </ds:schemaRefs>
+</ds:datastoreItem>
 </file>
</xml_diff>